<commit_message>
added Business Requirment Document
</commit_message>
<xml_diff>
--- a/05TO-BE Process.docx
+++ b/05TO-BE Process.docx
@@ -1271,6 +1271,8 @@
           <w:b/>
           <w:bCs/>
           <w:color w:val="4472C4" w:themeColor="accent1"/>
+          <w:sz w:val="32"/>
+          <w:szCs w:val="32"/>
         </w:rPr>
       </w:pPr>
       <w:r>
@@ -1278,6 +1280,8 @@
           <w:b/>
           <w:bCs/>
           <w:color w:val="4472C4" w:themeColor="accent1"/>
+          <w:sz w:val="32"/>
+          <w:szCs w:val="32"/>
         </w:rPr>
         <w:t>AS-IS VS TO-BE COMPARISON</w:t>
       </w:r>

</xml_diff>